<commit_message>
Rename course to AI Systems Engineering (subtitle: the five Ops)
- title now 'AI Systems Engineering'; subtitle 'DevOps, DataOps, MLOps, LLMOps, AgentOps'
- Hebrew title 'הנדסת מערכות בינה מלאכותית'
- updated across home, references, prereq, all lesson plans (gen.py BRAND/FOOT), README, and the four catalogue Word docs (render-verified, letterhead intact)
- kept AgentOps (standard spelling) for consistency with all materials

Co-Authored-By: Claude Opus 4.8 <noreply@anthropic.com>
</commit_message>
<xml_diff>
--- a/hit-catalogue/catalogue_summary.docx
+++ b/hit-catalogue/catalogue_summary.docx
@@ -26,7 +26,7 @@
           <w:b/>
           <w:rtl/>
         </w:rPr>
-        <w:t>מערכות בינה מלאכותית מודרניות: פיתוח, הטמעה ותפעול</w:t>
+        <w:t>הנדסת מערכות בינה מלאכותית</w:t>
       </w:r>
     </w:p>
     <w:p>
@@ -34,7 +34,7 @@
         <w:jc w:val="left"/>
       </w:pPr>
       <w:r>
-        <w:t>Modern AI Systems: Development, Deployment and Operations</w:t>
+        <w:t>AI Systems Engineering</w:t>
       </w:r>
     </w:p>
     <w:p>
@@ -117,7 +117,7 @@
         <w:rPr>
           <w:b/>
         </w:rPr>
-        <w:t>Modern AI Systems: Development, Deployment and Operations</w:t>
+        <w:t>AI Systems Engineering</w:t>
       </w:r>
     </w:p>
     <w:p>

</xml_diff>

<commit_message>
Rename English title to 'Engineering of AI Systems'
Mirrors the Hebrew הנדסת מערכות בינה מלאכותית word-for-word; applied across home, references, prereq, all lesson plans, README, and the four catalogue Word docs (render-verified, letterhead intact). Hebrew unchanged.

Co-Authored-By: Claude Opus 4.8 <noreply@anthropic.com>
</commit_message>
<xml_diff>
--- a/hit-catalogue/catalogue_summary.docx
+++ b/hit-catalogue/catalogue_summary.docx
@@ -34,7 +34,7 @@
         <w:jc w:val="left"/>
       </w:pPr>
       <w:r>
-        <w:t>AI Systems Engineering</w:t>
+        <w:t>Engineering of AI Systems</w:t>
       </w:r>
     </w:p>
     <w:p>
@@ -117,7 +117,7 @@
         <w:rPr>
           <w:b/>
         </w:rPr>
-        <w:t>AI Systems Engineering</w:t>
+        <w:t>Engineering of AI Systems</w:t>
       </w:r>
     </w:p>
     <w:p>

</xml_diff>